<commit_message>
Update report for lab06
</commit_message>
<xml_diff>
--- a/Labs_6_Final/Lab6.docx
+++ b/Labs_6_Final/Lab6.docx
@@ -19,9 +19,8 @@
           <w:sz w:val="32"/>
           <w:szCs w:val="32"/>
         </w:rPr>
-        <w:t>23110156_</w:t>
-      </w:r>
-      <w:proofErr w:type="gramStart"/>
+        <w:t>23110156_NguyenMinhHoang__ASP_Lab0</w:t>
+      </w:r>
       <w:r>
         <w:rPr>
           <w:b/>
@@ -29,25 +28,6 @@
           <w:sz w:val="32"/>
           <w:szCs w:val="32"/>
         </w:rPr>
-        <w:t>NguyenMinhHoang__</w:t>
-      </w:r>
-      <w:proofErr w:type="gramEnd"/>
-      <w:r>
-        <w:rPr>
-          <w:b/>
-          <w:bCs/>
-          <w:sz w:val="32"/>
-          <w:szCs w:val="32"/>
-        </w:rPr>
-        <w:t>ASP_Lab0</w:t>
-      </w:r>
-      <w:r>
-        <w:rPr>
-          <w:b/>
-          <w:bCs/>
-          <w:sz w:val="32"/>
-          <w:szCs w:val="32"/>
-        </w:rPr>
         <w:t>6</w:t>
       </w:r>
     </w:p>
@@ -69,6 +49,27 @@
         </w:rPr>
         <w:t>Link github:</w:t>
       </w:r>
+      <w:r>
+        <w:rPr>
+          <w:b/>
+          <w:bCs/>
+          <w:sz w:val="28"/>
+          <w:szCs w:val="28"/>
+        </w:rPr>
+        <w:t xml:space="preserve"> </w:t>
+      </w:r>
+      <w:hyperlink r:id="rId5" w:history="1">
+        <w:r>
+          <w:rPr>
+            <w:rStyle w:val="Hyperlink"/>
+            <w:b/>
+            <w:bCs/>
+            <w:sz w:val="28"/>
+            <w:szCs w:val="28"/>
+          </w:rPr>
+          <w:t>https://github.com/tin1508/Asp.Net_TTH/tree/Lab06/Labs_6_Final</w:t>
+        </w:r>
+      </w:hyperlink>
     </w:p>
     <w:p>
       <w:pPr>
@@ -112,13 +113,7 @@
     </w:p>
     <w:p>
       <w:r>
-        <w:t xml:space="preserve">Ứng dụng Stationery Store là hệ thống quản </w:t>
-      </w:r>
-      <w:r>
-        <w:t>lý</w:t>
-      </w:r>
-      <w:r>
-        <w:t xml:space="preserve"> dữ liệu văn phòng phẩm, hỗ trợ quản lý danh mục (Category), sản phẩm (Stationery), và giỏ hàng (Cart). Hệ thống áp dụng đầy đủ các nhóm năng lực cốt lõi của ASP.NET Core MVC.</w:t>
+        <w:t>Ứng dụng Stationery Store là hệ thống quản lý dữ liệu văn phòng phẩm, hỗ trợ quản lý danh mục (Category), sản phẩm (Stationery), và giỏ hàng (Cart). Hệ thống áp dụng đầy đủ các nhóm năng lực cốt lõi của ASP.NET Core MVC.</w:t>
       </w:r>
     </w:p>
     <w:p>
@@ -153,6 +148,7 @@
         <w:rPr>
           <w:b/>
           <w:bCs/>
+          <w:noProof/>
           <w:sz w:val="28"/>
           <w:szCs w:val="28"/>
         </w:rPr>
@@ -172,7 +168,7 @@
                     <pic:cNvPicPr/>
                   </pic:nvPicPr>
                   <pic:blipFill>
-                    <a:blip r:embed="rId5"/>
+                    <a:blip r:embed="rId6"/>
                     <a:stretch>
                       <a:fillRect/>
                     </a:stretch>
@@ -293,6 +289,7 @@
       </w:pPr>
       <w:r>
         <w:rPr>
+          <w:noProof/>
           <w:sz w:val="28"/>
           <w:szCs w:val="28"/>
         </w:rPr>
@@ -313,7 +310,7 @@
                     <pic:cNvPicPr/>
                   </pic:nvPicPr>
                   <pic:blipFill>
-                    <a:blip r:embed="rId6"/>
+                    <a:blip r:embed="rId7"/>
                     <a:stretch>
                       <a:fillRect/>
                     </a:stretch>
@@ -391,7 +388,7 @@
           <w:szCs w:val="28"/>
         </w:rPr>
       </w:pPr>
-      <w:hyperlink r:id="rId7" w:history="1">
+      <w:hyperlink r:id="rId8" w:history="1">
         <w:r>
           <w:rPr>
             <w:rStyle w:val="Hyperlink"/>
@@ -436,6 +433,7 @@
         <w:rPr>
           <w:b/>
           <w:bCs/>
+          <w:noProof/>
           <w:sz w:val="28"/>
           <w:szCs w:val="28"/>
         </w:rPr>
@@ -455,7 +453,7 @@
                     <pic:cNvPicPr/>
                   </pic:nvPicPr>
                   <pic:blipFill>
-                    <a:blip r:embed="rId8"/>
+                    <a:blip r:embed="rId9"/>
                     <a:stretch>
                       <a:fillRect/>
                     </a:stretch>
@@ -528,6 +526,7 @@
         <w:rPr>
           <w:b/>
           <w:bCs/>
+          <w:noProof/>
           <w:sz w:val="28"/>
           <w:szCs w:val="28"/>
         </w:rPr>
@@ -547,7 +546,7 @@
                     <pic:cNvPicPr/>
                   </pic:nvPicPr>
                   <pic:blipFill>
-                    <a:blip r:embed="rId9"/>
+                    <a:blip r:embed="rId10"/>
                     <a:stretch>
                       <a:fillRect/>
                     </a:stretch>
@@ -600,6 +599,7 @@
         <w:rPr>
           <w:b/>
           <w:bCs/>
+          <w:noProof/>
           <w:sz w:val="28"/>
           <w:szCs w:val="28"/>
         </w:rPr>
@@ -619,7 +619,7 @@
                     <pic:cNvPicPr/>
                   </pic:nvPicPr>
                   <pic:blipFill>
-                    <a:blip r:embed="rId10"/>
+                    <a:blip r:embed="rId11"/>
                     <a:stretch>
                       <a:fillRect/>
                     </a:stretch>
@@ -691,6 +691,7 @@
         <w:rPr>
           <w:b/>
           <w:bCs/>
+          <w:noProof/>
           <w:sz w:val="28"/>
           <w:szCs w:val="28"/>
         </w:rPr>
@@ -711,7 +712,7 @@
                     <pic:cNvPicPr/>
                   </pic:nvPicPr>
                   <pic:blipFill>
-                    <a:blip r:embed="rId11"/>
+                    <a:blip r:embed="rId12"/>
                     <a:stretch>
                       <a:fillRect/>
                     </a:stretch>
@@ -764,6 +765,7 @@
         <w:rPr>
           <w:b/>
           <w:bCs/>
+          <w:noProof/>
           <w:sz w:val="28"/>
           <w:szCs w:val="28"/>
         </w:rPr>
@@ -783,7 +785,7 @@
                     <pic:cNvPicPr/>
                   </pic:nvPicPr>
                   <pic:blipFill>
-                    <a:blip r:embed="rId12"/>
+                    <a:blip r:embed="rId13"/>
                     <a:stretch>
                       <a:fillRect/>
                     </a:stretch>
@@ -857,6 +859,7 @@
         <w:rPr>
           <w:b/>
           <w:bCs/>
+          <w:noProof/>
           <w:sz w:val="28"/>
           <w:szCs w:val="28"/>
         </w:rPr>
@@ -877,7 +880,7 @@
                     <pic:cNvPicPr/>
                   </pic:nvPicPr>
                   <pic:blipFill>
-                    <a:blip r:embed="rId13"/>
+                    <a:blip r:embed="rId14"/>
                     <a:stretch>
                       <a:fillRect/>
                     </a:stretch>
@@ -930,6 +933,7 @@
         <w:rPr>
           <w:b/>
           <w:bCs/>
+          <w:noProof/>
           <w:sz w:val="28"/>
           <w:szCs w:val="28"/>
         </w:rPr>
@@ -949,7 +953,7 @@
                     <pic:cNvPicPr/>
                   </pic:nvPicPr>
                   <pic:blipFill>
-                    <a:blip r:embed="rId14"/>
+                    <a:blip r:embed="rId15"/>
                     <a:stretch>
                       <a:fillRect/>
                     </a:stretch>
@@ -1002,6 +1006,7 @@
         <w:rPr>
           <w:b/>
           <w:bCs/>
+          <w:noProof/>
           <w:sz w:val="28"/>
           <w:szCs w:val="28"/>
         </w:rPr>
@@ -1022,7 +1027,7 @@
                     <pic:cNvPicPr/>
                   </pic:nvPicPr>
                   <pic:blipFill>
-                    <a:blip r:embed="rId15"/>
+                    <a:blip r:embed="rId16"/>
                     <a:stretch>
                       <a:fillRect/>
                     </a:stretch>
@@ -1056,6 +1061,7 @@
         <w:rPr>
           <w:b/>
           <w:bCs/>
+          <w:noProof/>
           <w:sz w:val="28"/>
           <w:szCs w:val="28"/>
         </w:rPr>
@@ -1075,7 +1081,7 @@
                     <pic:cNvPicPr/>
                   </pic:nvPicPr>
                   <pic:blipFill>
-                    <a:blip r:embed="rId16"/>
+                    <a:blip r:embed="rId17"/>
                     <a:stretch>
                       <a:fillRect/>
                     </a:stretch>
@@ -1120,6 +1126,7 @@
       </w:pPr>
       <w:r>
         <w:rPr>
+          <w:noProof/>
           <w:sz w:val="28"/>
           <w:szCs w:val="28"/>
         </w:rPr>
@@ -1139,7 +1146,7 @@
                     <pic:cNvPicPr/>
                   </pic:nvPicPr>
                   <pic:blipFill>
-                    <a:blip r:embed="rId17"/>
+                    <a:blip r:embed="rId18"/>
                     <a:stretch>
                       <a:fillRect/>
                     </a:stretch>
@@ -1184,6 +1191,7 @@
       </w:pPr>
       <w:r>
         <w:rPr>
+          <w:noProof/>
           <w:sz w:val="28"/>
           <w:szCs w:val="28"/>
         </w:rPr>
@@ -1204,7 +1212,7 @@
                     <pic:cNvPicPr/>
                   </pic:nvPicPr>
                   <pic:blipFill>
-                    <a:blip r:embed="rId18"/>
+                    <a:blip r:embed="rId19"/>
                     <a:stretch>
                       <a:fillRect/>
                     </a:stretch>
@@ -1249,6 +1257,7 @@
       </w:pPr>
       <w:r>
         <w:rPr>
+          <w:noProof/>
           <w:sz w:val="28"/>
           <w:szCs w:val="28"/>
         </w:rPr>
@@ -1268,7 +1277,7 @@
                     <pic:cNvPicPr/>
                   </pic:nvPicPr>
                   <pic:blipFill>
-                    <a:blip r:embed="rId19"/>
+                    <a:blip r:embed="rId20"/>
                     <a:stretch>
                       <a:fillRect/>
                     </a:stretch>
@@ -1298,6 +1307,7 @@
       </w:pPr>
       <w:r>
         <w:rPr>
+          <w:noProof/>
           <w:sz w:val="28"/>
           <w:szCs w:val="28"/>
         </w:rPr>
@@ -1317,7 +1327,7 @@
                     <pic:cNvPicPr/>
                   </pic:nvPicPr>
                   <pic:blipFill>
-                    <a:blip r:embed="rId20"/>
+                    <a:blip r:embed="rId21"/>
                     <a:stretch>
                       <a:fillRect/>
                     </a:stretch>
@@ -1359,6 +1369,9 @@
     </w:p>
     <w:p>
       <w:r>
+        <w:rPr>
+          <w:noProof/>
+        </w:rPr>
         <w:drawing>
           <wp:inline distT="0" distB="0" distL="0" distR="0" wp14:anchorId="6171887D" wp14:editId="0CB0FBA3">
             <wp:extent cx="5998191" cy="3218260"/>
@@ -1375,7 +1388,7 @@
                     <pic:cNvPicPr/>
                   </pic:nvPicPr>
                   <pic:blipFill>
-                    <a:blip r:embed="rId21"/>
+                    <a:blip r:embed="rId22"/>
                     <a:stretch>
                       <a:fillRect/>
                     </a:stretch>
@@ -1422,6 +1435,7 @@
         <w:rPr>
           <w:b/>
           <w:bCs/>
+          <w:noProof/>
         </w:rPr>
         <w:lastRenderedPageBreak/>
         <w:drawing>
@@ -1440,7 +1454,7 @@
                     <pic:cNvPicPr/>
                   </pic:nvPicPr>
                   <pic:blipFill>
-                    <a:blip r:embed="rId22"/>
+                    <a:blip r:embed="rId23"/>
                     <a:stretch>
                       <a:fillRect/>
                     </a:stretch>
@@ -1487,6 +1501,7 @@
         <w:rPr>
           <w:b/>
           <w:bCs/>
+          <w:noProof/>
         </w:rPr>
         <w:drawing>
           <wp:inline distT="0" distB="0" distL="0" distR="0" wp14:anchorId="37589E2C" wp14:editId="0DAAB280">
@@ -1504,7 +1519,7 @@
                     <pic:cNvPicPr/>
                   </pic:nvPicPr>
                   <pic:blipFill>
-                    <a:blip r:embed="rId23"/>
+                    <a:blip r:embed="rId24"/>
                     <a:stretch>
                       <a:fillRect/>
                     </a:stretch>
@@ -1551,6 +1566,7 @@
         <w:rPr>
           <w:b/>
           <w:bCs/>
+          <w:noProof/>
         </w:rPr>
         <w:lastRenderedPageBreak/>
         <w:drawing>
@@ -1569,7 +1585,7 @@
                     <pic:cNvPicPr/>
                   </pic:nvPicPr>
                   <pic:blipFill>
-                    <a:blip r:embed="rId24"/>
+                    <a:blip r:embed="rId25"/>
                     <a:stretch>
                       <a:fillRect/>
                     </a:stretch>
@@ -1616,6 +1632,7 @@
         <w:rPr>
           <w:b/>
           <w:bCs/>
+          <w:noProof/>
         </w:rPr>
         <w:drawing>
           <wp:inline distT="0" distB="0" distL="0" distR="0" wp14:anchorId="6545A672" wp14:editId="384494B1">
@@ -1633,7 +1650,7 @@
                     <pic:cNvPicPr/>
                   </pic:nvPicPr>
                   <pic:blipFill>
-                    <a:blip r:embed="rId25"/>
+                    <a:blip r:embed="rId26"/>
                     <a:stretch>
                       <a:fillRect/>
                     </a:stretch>
@@ -1680,6 +1697,7 @@
         <w:rPr>
           <w:b/>
           <w:bCs/>
+          <w:noProof/>
         </w:rPr>
         <w:drawing>
           <wp:inline distT="0" distB="0" distL="0" distR="0" wp14:anchorId="6F9E7454" wp14:editId="0AA9521E">
@@ -1697,7 +1715,7 @@
                     <pic:cNvPicPr/>
                   </pic:nvPicPr>
                   <pic:blipFill>
-                    <a:blip r:embed="rId26"/>
+                    <a:blip r:embed="rId27"/>
                     <a:stretch>
                       <a:fillRect/>
                     </a:stretch>
@@ -1745,6 +1763,7 @@
         <w:rPr>
           <w:b/>
           <w:bCs/>
+          <w:noProof/>
         </w:rPr>
         <w:drawing>
           <wp:inline distT="0" distB="0" distL="0" distR="0" wp14:anchorId="21391B27" wp14:editId="09C0ECF8">
@@ -1762,7 +1781,7 @@
                     <pic:cNvPicPr/>
                   </pic:nvPicPr>
                   <pic:blipFill>
-                    <a:blip r:embed="rId27"/>
+                    <a:blip r:embed="rId28"/>
                     <a:stretch>
                       <a:fillRect/>
                     </a:stretch>
@@ -1856,6 +1875,7 @@
         <w:rPr>
           <w:b/>
           <w:bCs/>
+          <w:noProof/>
         </w:rPr>
         <w:drawing>
           <wp:inline distT="0" distB="0" distL="0" distR="0" wp14:anchorId="2BA783A6" wp14:editId="598102FA">
@@ -1873,7 +1893,7 @@
                     <pic:cNvPicPr/>
                   </pic:nvPicPr>
                   <pic:blipFill>
-                    <a:blip r:embed="rId28"/>
+                    <a:blip r:embed="rId29"/>
                     <a:stretch>
                       <a:fillRect/>
                     </a:stretch>
@@ -1958,6 +1978,7 @@
         <w:rPr>
           <w:b/>
           <w:bCs/>
+          <w:noProof/>
         </w:rPr>
         <w:lastRenderedPageBreak/>
         <w:drawing>
@@ -1984,7 +2005,7 @@
                     <pic:cNvPicPr/>
                   </pic:nvPicPr>
                   <pic:blipFill>
-                    <a:blip r:embed="rId29">
+                    <a:blip r:embed="rId30">
                       <a:extLst>
                         <a:ext uri="{28A0092B-C50C-407E-A947-70E740481C1C}">
                           <a14:useLocalDpi xmlns:a14="http://schemas.microsoft.com/office/drawing/2010/main" val="0"/>
@@ -2036,6 +2057,7 @@
         <w:rPr>
           <w:b/>
           <w:bCs/>
+          <w:noProof/>
         </w:rPr>
         <w:drawing>
           <wp:inline distT="0" distB="0" distL="0" distR="0" wp14:anchorId="514D56B9" wp14:editId="7BFBD989">
@@ -2053,7 +2075,7 @@
                     <pic:cNvPicPr/>
                   </pic:nvPicPr>
                   <pic:blipFill>
-                    <a:blip r:embed="rId30"/>
+                    <a:blip r:embed="rId31"/>
                     <a:stretch>
                       <a:fillRect/>
                     </a:stretch>
@@ -2115,6 +2137,7 @@
         <w:rPr>
           <w:b/>
           <w:bCs/>
+          <w:noProof/>
         </w:rPr>
         <w:drawing>
           <wp:inline distT="0" distB="0" distL="0" distR="0" wp14:anchorId="54E91A8A" wp14:editId="248AED76">
@@ -2132,7 +2155,7 @@
                     <pic:cNvPicPr/>
                   </pic:nvPicPr>
                   <pic:blipFill>
-                    <a:blip r:embed="rId31"/>
+                    <a:blip r:embed="rId32"/>
                     <a:stretch>
                       <a:fillRect/>
                     </a:stretch>
@@ -2164,6 +2187,7 @@
         <w:rPr>
           <w:b/>
           <w:bCs/>
+          <w:noProof/>
         </w:rPr>
         <w:lastRenderedPageBreak/>
         <w:drawing>
@@ -2182,7 +2206,7 @@
                     <pic:cNvPicPr/>
                   </pic:nvPicPr>
                   <pic:blipFill>
-                    <a:blip r:embed="rId32"/>
+                    <a:blip r:embed="rId33"/>
                     <a:stretch>
                       <a:fillRect/>
                     </a:stretch>
@@ -2229,6 +2253,7 @@
         <w:rPr>
           <w:b/>
           <w:bCs/>
+          <w:noProof/>
         </w:rPr>
         <w:drawing>
           <wp:inline distT="0" distB="0" distL="0" distR="0" wp14:anchorId="19132782" wp14:editId="5F03EFBE">
@@ -2246,7 +2271,7 @@
                     <pic:cNvPicPr/>
                   </pic:nvPicPr>
                   <pic:blipFill>
-                    <a:blip r:embed="rId33"/>
+                    <a:blip r:embed="rId34"/>
                     <a:stretch>
                       <a:fillRect/>
                     </a:stretch>
@@ -2308,6 +2333,7 @@
         <w:rPr>
           <w:b/>
           <w:bCs/>
+          <w:noProof/>
         </w:rPr>
         <w:lastRenderedPageBreak/>
         <w:drawing>
@@ -2326,7 +2352,7 @@
                     <pic:cNvPicPr/>
                   </pic:nvPicPr>
                   <pic:blipFill>
-                    <a:blip r:embed="rId34"/>
+                    <a:blip r:embed="rId35"/>
                     <a:stretch>
                       <a:fillRect/>
                     </a:stretch>
@@ -2373,6 +2399,7 @@
         <w:rPr>
           <w:b/>
           <w:bCs/>
+          <w:noProof/>
         </w:rPr>
         <w:drawing>
           <wp:inline distT="0" distB="0" distL="0" distR="0" wp14:anchorId="457A982A" wp14:editId="42126A56">
@@ -2390,7 +2417,7 @@
                     <pic:cNvPicPr/>
                   </pic:nvPicPr>
                   <pic:blipFill>
-                    <a:blip r:embed="rId35"/>
+                    <a:blip r:embed="rId36"/>
                     <a:stretch>
                       <a:fillRect/>
                     </a:stretch>
@@ -2437,6 +2464,7 @@
         <w:rPr>
           <w:b/>
           <w:bCs/>
+          <w:noProof/>
         </w:rPr>
         <w:lastRenderedPageBreak/>
         <w:drawing>
@@ -2455,7 +2483,7 @@
                     <pic:cNvPicPr/>
                   </pic:nvPicPr>
                   <pic:blipFill>
-                    <a:blip r:embed="rId36"/>
+                    <a:blip r:embed="rId37"/>
                     <a:stretch>
                       <a:fillRect/>
                     </a:stretch>
@@ -2549,6 +2577,7 @@
         <w:rPr>
           <w:b/>
           <w:bCs/>
+          <w:noProof/>
         </w:rPr>
         <w:drawing>
           <wp:inline distT="0" distB="0" distL="0" distR="0" wp14:anchorId="540B4A7A" wp14:editId="0121590D">
@@ -2566,7 +2595,7 @@
                     <pic:cNvPicPr/>
                   </pic:nvPicPr>
                   <pic:blipFill>
-                    <a:blip r:embed="rId37"/>
+                    <a:blip r:embed="rId38"/>
                     <a:stretch>
                       <a:fillRect/>
                     </a:stretch>
@@ -2619,6 +2648,7 @@
         <w:rPr>
           <w:b/>
           <w:bCs/>
+          <w:noProof/>
         </w:rPr>
         <w:lastRenderedPageBreak/>
         <w:drawing>
@@ -2637,7 +2667,7 @@
                     <pic:cNvPicPr/>
                   </pic:nvPicPr>
                   <pic:blipFill>
-                    <a:blip r:embed="rId38"/>
+                    <a:blip r:embed="rId39"/>
                     <a:stretch>
                       <a:fillRect/>
                     </a:stretch>
@@ -2723,6 +2753,7 @@
         <w:rPr>
           <w:b/>
           <w:bCs/>
+          <w:noProof/>
         </w:rPr>
         <w:drawing>
           <wp:inline distT="0" distB="0" distL="0" distR="0" wp14:anchorId="3189BD7F" wp14:editId="072BDB71">
@@ -2740,7 +2771,7 @@
                     <pic:cNvPicPr/>
                   </pic:nvPicPr>
                   <pic:blipFill>
-                    <a:blip r:embed="rId39"/>
+                    <a:blip r:embed="rId40"/>
                     <a:stretch>
                       <a:fillRect/>
                     </a:stretch>
@@ -2817,7 +2848,7 @@
                     <pic:cNvPicPr/>
                   </pic:nvPicPr>
                   <pic:blipFill>
-                    <a:blip r:embed="rId40"/>
+                    <a:blip r:embed="rId41"/>
                     <a:stretch>
                       <a:fillRect/>
                     </a:stretch>
@@ -2973,15 +3004,7 @@
         <w:t>, Swagger</w:t>
       </w:r>
       <w:r>
-        <w:t xml:space="preserve"> để gửi POST request trực tiếp. Bắt buộc phải dùng [</w:t>
-      </w:r>
-      <w:proofErr w:type="gramStart"/>
-      <w:r>
-        <w:t>Authorize(</w:t>
-      </w:r>
-      <w:proofErr w:type="gramEnd"/>
-      <w:r>
-        <w:t>Roles="Admin")] ở Server để hệ thống từ chối mọi request không hợp lệ ngay tại Controller.</w:t>
+        <w:t xml:space="preserve"> để gửi POST request trực tiếp. Bắt buộc phải dùng [Authorize(Roles="Admin")] ở Server để hệ thống từ chối mọi request không hợp lệ ngay tại Controller.</w:t>
       </w:r>
     </w:p>
     <w:p>
@@ -3093,15 +3116,7 @@
         </w:tabs>
       </w:pPr>
       <w:r>
-        <w:t>Dùng Role ([</w:t>
-      </w:r>
-      <w:proofErr w:type="gramStart"/>
-      <w:r>
-        <w:t>Authorize(</w:t>
-      </w:r>
-      <w:proofErr w:type="gramEnd"/>
-      <w:r>
-        <w:t>Roles="Admin")]) cho các phân quyền lớn, quản trị toàn trang. Dùng Policy (CanAdjustStock) cho các nghiệp vụ vi mô, cần kết hợp nhiều điều kiện (VD: Chỉ Staff thuộc phòng kho mới được sửa tồn kho).</w:t>
+        <w:t>Dùng Role ([Authorize(Roles="Admin")]) cho các phân quyền lớn, quản trị toàn trang. Dùng Policy (CanAdjustStock) cho các nghiệp vụ vi mô, cần kết hợp nhiều điều kiện (VD: Chỉ Staff thuộc phòng kho mới được sửa tồn kho).</w:t>
       </w:r>
     </w:p>
     <w:p>
@@ -3255,25 +3270,7 @@
           <w:bCs/>
           <w:highlight w:val="yellow"/>
         </w:rPr>
-        <w:t xml:space="preserve">10. Vì sao @Model.Name </w:t>
-      </w:r>
-      <w:proofErr w:type="gramStart"/>
-      <w:r>
-        <w:rPr>
-          <w:b/>
-          <w:bCs/>
-          <w:highlight w:val="yellow"/>
-        </w:rPr>
-        <w:t>an</w:t>
-      </w:r>
-      <w:proofErr w:type="gramEnd"/>
-      <w:r>
-        <w:rPr>
-          <w:b/>
-          <w:bCs/>
-          <w:highlight w:val="yellow"/>
-        </w:rPr>
-        <w:t xml:space="preserve"> toàn hơn @Html.Raw(Model.Name)? Payload XSS minh họa:</w:t>
+        <w:t>10. Vì sao @Model.Name an toàn hơn @Html.Raw(Model.Name)? Payload XSS minh họa:</w:t>
       </w:r>
     </w:p>
     <w:p>
@@ -3304,23 +3301,7 @@
         <w:t>Payload:</w:t>
       </w:r>
       <w:r>
-        <w:t xml:space="preserve"> Kẻ gian nhập tên sản phẩm là &lt;script&gt;</w:t>
-      </w:r>
-      <w:proofErr w:type="gramStart"/>
-      <w:r>
-        <w:t>alert(</w:t>
-      </w:r>
-      <w:proofErr w:type="gramEnd"/>
-      <w:r>
-        <w:t>'Bị hack!</w:t>
-      </w:r>
-      <w:proofErr w:type="gramStart"/>
-      <w:r>
-        <w:t>');&lt;</w:t>
-      </w:r>
-      <w:proofErr w:type="gramEnd"/>
-      <w:r>
-        <w:t>/script&gt;. Nếu dùng Html.Raw, mọi user vào xem danh sách sản phẩm đều bị chạy đoạn script này</w:t>
+        <w:t xml:space="preserve"> Kẻ gian nhập tên sản phẩm là &lt;script&gt;alert('Bị hack!');&lt;/script&gt;. Nếu dùng Html.Raw, mọi user vào xem danh sách sản phẩm đều bị chạy đoạn script này</w:t>
       </w:r>
       <w:r>
         <w:rPr>
@@ -3426,15 +3407,7 @@
         <w:t>của dữ liệu. Vì n</w:t>
       </w:r>
       <w:r>
-        <w:t xml:space="preserve">ếu ta xóa ảnh cũ trước, sau đó hàm </w:t>
-      </w:r>
-      <w:proofErr w:type="gramStart"/>
-      <w:r>
-        <w:t>SaveChanges(</w:t>
-      </w:r>
-      <w:proofErr w:type="gramEnd"/>
-      <w:r>
-        <w:t xml:space="preserve">) lưu database thất bại, hệ thống sẽ rơi vào trạng thái "Database còn đường dẫn ảnh cũ, nhưng file vật lý đã bị xóa" </w:t>
+        <w:t xml:space="preserve">ếu ta xóa ảnh cũ trước, sau đó hàm SaveChanges() lưu database thất bại, hệ thống sẽ rơi vào trạng thái "Database còn đường dẫn ảnh cũ, nhưng file vật lý đã bị xóa" </w:t>
       </w:r>
       <w:r>
         <w:t>sẽ gây ra l</w:t>
@@ -3667,15 +3640,7 @@
         </w:tabs>
       </w:pPr>
       <w:r>
-        <w:t>Vi phạm nguyên lý Dependency Inversion. Code bị "dính chặt" (</w:t>
-      </w:r>
-      <w:proofErr w:type="gramStart"/>
-      <w:r>
-        <w:t>tight-coupling</w:t>
-      </w:r>
-      <w:proofErr w:type="gramEnd"/>
-      <w:r>
-        <w:t>) vào database thật. Khi viết Unit Test, không thể đưa Mock Repository vào để test độc lập logic của Service.</w:t>
+        <w:t>Vi phạm nguyên lý Dependency Inversion. Code bị "dính chặt" (tight-coupling) vào database thật. Khi viết Unit Test, không thể đưa Mock Repository vào để test độc lập logic của Service.</w:t>
       </w:r>
     </w:p>
     <w:p>
@@ -3733,15 +3698,7 @@
         </w:tabs>
       </w:pPr>
       <w:r>
-        <w:t xml:space="preserve">Hai Admin cùng mở trang Edit Bút bi. Admin A lưu giá 5000đ, RowVersion đổi từ 1 thành 2. Admin B (màn hình vẫn giữ RowVersion=1) bấm lưu giá 4000đ. EF Core so sánh thấy </w:t>
-      </w:r>
-      <w:proofErr w:type="gramStart"/>
-      <w:r>
-        <w:t>1 !</w:t>
-      </w:r>
-      <w:proofErr w:type="gramEnd"/>
-      <w:r>
-        <w:t>= 2 dưới database nên quăng lỗi DbUpdateConcurrencyException, chặn Admin B ghi đè công sức của Admin A.</w:t>
+        <w:t>Hai Admin cùng mở trang Edit Bút bi. Admin A lưu giá 5000đ, RowVersion đổi từ 1 thành 2. Admin B (màn hình vẫn giữ RowVersion=1) bấm lưu giá 4000đ. EF Core so sánh thấy 1 != 2 dưới database nên quăng lỗi DbUpdateConcurrencyException, chặn Admin B ghi đè công sức của Admin A.</w:t>
       </w:r>
     </w:p>
     <w:p>
@@ -3760,25 +3717,7 @@
           <w:bCs/>
           <w:highlight w:val="yellow"/>
         </w:rPr>
-        <w:t xml:space="preserve">21. Dùng global query filter IsDeleted=false, khi nào cần </w:t>
-      </w:r>
-      <w:proofErr w:type="gramStart"/>
-      <w:r>
-        <w:rPr>
-          <w:b/>
-          <w:bCs/>
-          <w:highlight w:val="yellow"/>
-        </w:rPr>
-        <w:t>IgnoreQueryFilters(</w:t>
-      </w:r>
-      <w:proofErr w:type="gramEnd"/>
-      <w:r>
-        <w:rPr>
-          <w:b/>
-          <w:bCs/>
-          <w:highlight w:val="yellow"/>
-        </w:rPr>
-        <w:t>)?</w:t>
+        <w:t>21. Dùng global query filter IsDeleted=false, khi nào cần IgnoreQueryFilters()?</w:t>
       </w:r>
     </w:p>
     <w:p>
@@ -5702,6 +5641,7 @@
   <w:style w:type="character" w:default="1" w:styleId="DefaultParagraphFont">
     <w:name w:val="Default Paragraph Font"/>
     <w:uiPriority w:val="1"/>
+    <w:semiHidden/>
     <w:unhideWhenUsed/>
   </w:style>
   <w:style w:type="table" w:default="1" w:styleId="TableNormal">

</xml_diff>